<commit_message>
Doc 54 + UST-19 SIGNED v3: D10 y D14 firmados (entrega A autorizada) — po257
</commit_message>
<xml_diff>
--- a/_integration/docs/ust/UST-2026-09-26-19-alta-publica-blindada-SIGNED.docx
+++ b/_integration/docs/ust/UST-2026-09-26-19-alta-publica-blindada-SIGNED.docx
@@ -63,7 +63,7 @@
           <w:sz w:val="20"/>
           <w:szCs w:val="20"/>
         </w:rPr>
-        <w:t xml:space="preserve">PROPUESTA · D1–D9 DECIDIDOS y FIRMADOS por Juanjo (26-sep: «D1 a D9, se implementan según las recomendaciones, no alternativas»); alcance 2+3+4+5+6+7. D10 y D14 (técnicas) pendientes de una palabra; D11–D13 las firman Pilar y Lucía (🗳 WL-2) antes de la entrega B. Nada construido.</w:t>
+        <w:t xml:space="preserve">PROPUESTA · D1–D10 y D14 DECIDIDOS y FIRMADOS por Juanjo (26-sep: «D1 a D9, se implementan según las recomendaciones, no alternativas» · «D10 y D14 según recomendaciones»); alcance 2+3+4+5+6+7. La entrega A (capas 2–5+7) queda AUTORIZADA; D11–D13 las firman Pilar y Lucía (🗳 WL-2) antes de la entrega B. Nada construido todavía.</w:t>
       </w:r>
     </w:p>
     <w:p>
@@ -2658,7 +2658,7 @@
           <w:sz w:val="30"/>
           <w:szCs w:val="30"/>
         </w:rPr>
-        <w:t xml:space="preserve">5 · Decisiones (fila a fila — D1–D9 decididas por Juanjo el 26-sep; D10 y D14 pendientes; D11–D13 las firman Pilar y Lucía)</w:t>
+        <w:t xml:space="preserve">5 · Decisiones (fila a fila — D1–D10 y D14 decididas por Juanjo el 26-sep; D11–D13 las firman Pilar y Lucía)</w:t>
       </w:r>
     </w:p>
     <w:tbl>
@@ -3932,7 +3932,7 @@
                 <w:sz w:val="16"/>
                 <w:szCs w:val="16"/>
               </w:rPr>
-              <w:t xml:space="preserve"/>
+              <w:t xml:space="preserve">DECIDIDO (Juanjo, 26-sep: «D10 y D14 según recomendaciones»): la propuesta — entrega A ahora (S19), B tras WL-2; el drop de la policy es el último paso.</w:t>
             </w:r>
           </w:p>
         </w:tc>
@@ -4388,7 +4388,7 @@
                 <w:sz w:val="16"/>
                 <w:szCs w:val="16"/>
               </w:rPr>
-              <w:t xml:space="preserve"/>
+              <w:t xml:space="preserve">DECIDIDO: la propuesta — tres columnas en waitlist, sin tabla aparte.</w:t>
             </w:r>
           </w:p>
         </w:tc>
@@ -5226,7 +5226,7 @@
                 <w:sz w:val="16"/>
                 <w:szCs w:val="16"/>
               </w:rPr>
-              <w:t xml:space="preserve">Carril técnico: D1–D9 DECIDIDOS y FIRMADOS por Juanjo el 26-sep («se implementan según las recomendaciones, no alternativas»; firma electrónica simple abajo); D10 y D14 pendientes de una palabra (se firman en el as-built). Carril producto: Pilar y Lucía firman D11–D13 (🗳 WL-2) ANTES de construir la entrega B. Pilar corrobora además la desviación po74 (D3) antes del Deploy Web de A.</w:t>
+              <w:t xml:space="preserve">Carril técnico: D1–D10 y D14 DECIDIDOS y FIRMADOS por Juanjo el 26-sep («se implementan según las recomendaciones, no alternativas» · «D10 y D14 según recomendaciones»; firma electrónica simple abajo) → la entrega A arranca. Carril producto: Pilar y Lucía firman D11–D13 (🗳 WL-2) ANTES de construir la entrega B. Pilar corrobora además la desviación po74 (D3) antes del Deploy Web de A.</w:t>
             </w:r>
           </w:p>
         </w:tc>
@@ -6286,7 +6286,7 @@
                 <w:sz w:val="16"/>
                 <w:szCs w:val="16"/>
               </w:rPr>
-              <w:t xml:space="preserve">ef7f3d3313f1ec873eabfdf81770da7c66298149d6aec3e7728d80ba8681ac66</w:t>
+              <w:t xml:space="preserve">996b71678e7669a84bc38d914aaf0b6eef62a1c4c2c7ff621c432093f41790cb</w:t>
             </w:r>
           </w:p>
         </w:tc>
@@ -6345,7 +6345,7 @@
                 <w:sz w:val="16"/>
                 <w:szCs w:val="16"/>
               </w:rPr>
-              <w:t xml:space="preserve">2026-09-26 20:00:28 UTC  ·  2026-09-26 23:00:28 EEST</w:t>
+              <w:t xml:space="preserve">2026-09-26 20:06:56 UTC  ·  2026-09-26 23:06:56 EEST</w:t>
             </w:r>
           </w:p>
         </w:tc>
@@ -6463,7 +6463,7 @@
                 <w:sz w:val="16"/>
                 <w:szCs w:val="16"/>
               </w:rPr>
-              <w:t xml:space="preserve">D1–D9 según las recomendaciones («UST-19 - D1 a D9, se implementan según las recomendaciones, no alternativas», 26-sep): cerrar el REST para anon · puerta única /api/waitlist + secreto de gateway en la Edge · Turnstile «Managed» (desviación po74 declarada, Pilar corrobora) · sin JS se acepta con ritmo estricto · ritmo por hash de IP 5/h y por email 3/24 h · regla WAF 10/10 s, Bot Fight Mode NO · las guardas de UST-18 se quedan · línea en el digest + ⚠ &gt; 50 · carril técnico. Alcance 2+3+4+5+6+7 («hay que meter también 6»). PENDIENTES: D10 y D14 (una palabra de Juanjo) · D11–D13 = 🗳 WL-2 (firma de Pilar y Lucía) antes de la entrega B. Nada construido.</w:t>
+              <w:t xml:space="preserve">D1–D9 según las recomendaciones («UST-19 - D1 a D9, se implementan según las recomendaciones, no alternativas», 26-sep): cerrar el REST para anon · puerta única /api/waitlist + secreto de gateway en la Edge · Turnstile «Managed» (desviación po74 declarada, Pilar corrobora) · sin JS se acepta con ritmo estricto · ritmo por hash de IP 5/h y por email 3/24 h · regla WAF 10/10 s, Bot Fight Mode NO · las guardas de UST-18 se quedan · línea en el digest + ⚠ &gt; 50 · carril técnico. Alcance 2+3+4+5+6+7 («hay que meter también 6»). D10 y D14 también según las recomendaciones («D10 y D14 según recomendaciones», 26-sep): entrega A ahora y B tras WL-2, drop de la policy el último; confirmación en tres columnas de waitlist. Entrega A AUTORIZADA. PENDIENTE: D11–D13 = 🗳 WL-2 (firma de Pilar y Lucía) antes de la entrega B. Nada construido todavía.</w:t>
             </w:r>
           </w:p>
         </w:tc>

</xml_diff>